<commit_message>
docs(linkedin): refonte pour démarrage à ZÉRO audience
L'ancienne version supposait une audience existante. Nouvelle approche : construire
les 1res connexions (invitations ciblées), exister via les commentaires, activer le
réseau réel, PUIS poster. Calendrier réaliste + attentes honnêtes pour un débutant.

Co-Authored-By: Claude Opus 4.8 <noreply@anthropic.com>
</commit_message>
<xml_diff>
--- a/docs/LINKEDIN_LANCEMENT.docx
+++ b/docs/LINKEDIN_LANCEMENT.docx
@@ -7,7 +7,7 @@
         <w:pStyle w:val="Heading1"/>
       </w:pPr>
       <w:r>
-        <w:t>GetShift — Plan de lancement LinkedIn (du début à la fin)</w:t>
+        <w:t>GetShift — Plan de lancement LinkedIn (en PARTANT DE ZÉRO)</w:t>
       </w:r>
     </w:p>
     <w:p>
@@ -19,21 +19,21 @@
           <w:i/>
           <w:color w:val="555555"/>
         </w:rPr>
-        <w:t xml:space="preserve">Pour Hamdaane, fondateur solo, étudiant data science. Objectif : faire connaître GetShift, créer une audience, et alimenter les inscriptions. 2026-06-03. Langue des posts : </w:t>
+        <w:t xml:space="preserve">Pour Hamdaane, 17 ans, </w:t>
       </w:r>
       <w:r>
         <w:rPr>
           <w:b/>
           <w:i/>
         </w:rPr>
-        <w:t>français</w:t>
+        <w:t>0 audience au départ</w:t>
       </w:r>
       <w:r>
         <w:rPr>
           <w:i/>
           <w:color w:val="555555"/>
         </w:rPr>
-        <w:t xml:space="preserve"> (ton marché actuel) — on traduira plus tard.</w:t>
+        <w:t>. Le vrai problème d'un débutant n'est pas « quoi écrire » — c'est « personne ne me voit ». Ce plan attaque CE problème d'abord. Langue : français. 2026-06-04.</w:t>
       </w:r>
     </w:p>
     <w:p>
@@ -49,59 +49,71 @@
         <w:pStyle w:val="Heading2"/>
       </w:pPr>
       <w:r>
-        <w:t>0. L'angle qui marche pour toi : « build in public » d'un étudiant solo</w:t>
+        <w:t>La vérité de départ (à accepter)</w:t>
       </w:r>
     </w:p>
     <w:p>
       <w:r>
-        <w:t xml:space="preserve">Tu n'as pas un gros budget ni une équipe. Ta force, c'est </w:t>
+        <w:t>Quand tu as 0 abonné, ton premier post sera vu par… presque personne. C'est NORMAL. Sur LinkedIn, au début, la croissance ne vient PAS de tes posts — elle vient de :</w:t>
+      </w:r>
+    </w:p>
+    <w:p>
+      <w:pPr>
+        <w:pStyle w:val="ListNumber"/>
+      </w:pPr>
+      <w:r>
+        <w:rPr>
+          <w:b/>
+        </w:rPr>
+        <w:t>Les connexions que tu vas chercher activement.</w:t>
+      </w:r>
+    </w:p>
+    <w:p>
+      <w:pPr>
+        <w:pStyle w:val="ListNumber"/>
+      </w:pPr>
+      <w:r>
+        <w:rPr>
+          <w:b/>
+        </w:rPr>
+        <w:t>Tes commentaires sous les posts des autres</w:t>
+      </w:r>
+      <w:r>
+        <w:t xml:space="preserve"> (là où l'audience existe déjà).</w:t>
+      </w:r>
+    </w:p>
+    <w:p>
+      <w:pPr>
+        <w:pStyle w:val="ListNumber"/>
+      </w:pPr>
+      <w:r>
+        <w:rPr>
+          <w:b/>
+        </w:rPr>
+        <w:t>Ton réseau réel</w:t>
+      </w:r>
+      <w:r>
+        <w:t xml:space="preserve"> que tu fais venir (classe, Sèmè City, WhatsApp).</w:t>
+      </w:r>
+    </w:p>
+    <w:p>
+      <w:r>
+        <w:t xml:space="preserve">Tes posts, au début, servent surtout de </w:t>
       </w:r>
       <w:r>
         <w:rPr>
           <w:b/>
         </w:rPr>
-        <w:t>l'histoire</w:t>
+        <w:t>vitrine</w:t>
       </w:r>
       <w:r>
-        <w:t xml:space="preserve"> : un </w:t>
+        <w:t xml:space="preserve"> pour ceux que tu attires par 1, 2 et 3. Donc l'ordre est : </w:t>
       </w:r>
       <w:r>
         <w:rPr>
           <w:b/>
         </w:rPr>
-        <w:t>étudiant en data science</w:t>
-      </w:r>
-      <w:r>
-        <w:t xml:space="preserve"> qui construit </w:t>
-      </w:r>
-      <w:r>
-        <w:rPr>
-          <w:b/>
-        </w:rPr>
-        <w:t>seul</w:t>
-      </w:r>
-      <w:r>
-        <w:t xml:space="preserve"> un vrai SaaS IA, en public. Les gens ne suivent pas un produit, ils suivent </w:t>
-      </w:r>
-      <w:r>
-        <w:rPr>
-          <w:b/>
-        </w:rPr>
-        <w:t>une personne qui ose</w:t>
-      </w:r>
-      <w:r>
-        <w:t>. C'est ça qui crée l'attachement (et les premiers utilisateurs).</w:t>
-      </w:r>
-    </w:p>
-    <w:p>
-      <w:r>
-        <w:rPr>
-          <w:b/>
-        </w:rPr>
-        <w:t>Ton fil rouge :</w:t>
-      </w:r>
-      <w:r>
-        <w:t xml:space="preserve"> « Je construis GetShift en public. Voici ce que j'apprends, ce qui marche, ce qui casse. »</w:t>
+        <w:t>construire l'audience → puis les posts convertissent.</w:t>
       </w:r>
     </w:p>
     <w:p>
@@ -117,7 +129,12 @@
         <w:pStyle w:val="Heading2"/>
       </w:pPr>
       <w:r>
-        <w:t>1. AVANT de poster (1 jour de prépa)</w:t>
+        <w:t>ÉTAPE 0 — Le profil (avant tout post)</w:t>
+      </w:r>
+    </w:p>
+    <w:p>
+      <w:r>
+        <w:t>Personne ne s'abonne à un profil vide. Avant de poster une seule fois :</w:t>
       </w:r>
     </w:p>
     <w:p>
@@ -131,19 +148,10 @@
         <w:rPr>
           <w:b/>
         </w:rPr>
-        <w:t>Photo de profil</w:t>
+        <w:t>Photo</w:t>
       </w:r>
       <w:r>
-        <w:t xml:space="preserve"> nette + </w:t>
-      </w:r>
-      <w:r>
-        <w:rPr>
-          <w:b/>
-        </w:rPr>
-        <w:t>bannière</w:t>
-      </w:r>
-      <w:r>
-        <w:t xml:space="preserve"> LinkedIn aux couleurs GetShift (logo + « L'assistant IA qui planifie ta journée »).</w:t>
+        <w:t xml:space="preserve"> nette, souriante (téléphone + bonne lumière suffit).</w:t>
       </w:r>
     </w:p>
     <w:p>
@@ -157,17 +165,10 @@
         <w:rPr>
           <w:b/>
         </w:rPr>
-        <w:t>Titre LinkedIn</w:t>
+        <w:t>Bannière</w:t>
       </w:r>
       <w:r>
-        <w:t xml:space="preserve"> : </w:t>
-      </w:r>
-      <w:r>
-        <w:rPr>
-          <w:rFonts w:ascii="Consolas" w:hAnsi="Consolas"/>
-          <w:color w:val="B8521C"/>
-        </w:rPr>
-        <w:t>Étudiant Data Science · Je construis GetShift, l'assistant de productivité IA 🧩</w:t>
+        <w:t xml:space="preserve"> GetShift (logo + « L'assistant IA qui planifie ta journée »).</w:t>
       </w:r>
     </w:p>
     <w:p>
@@ -181,10 +182,34 @@
         <w:rPr>
           <w:b/>
         </w:rPr>
-        <w:t>Section « Infos »</w:t>
+        <w:t>Titre</w:t>
       </w:r>
       <w:r>
-        <w:t xml:space="preserve"> : 3 lignes — qui tu es, ce que tu construis, le lien </w:t>
+        <w:t xml:space="preserve"> : </w:t>
+      </w:r>
+      <w:r>
+        <w:rPr>
+          <w:rFonts w:ascii="Consolas" w:hAnsi="Consolas"/>
+          <w:color w:val="B8521C"/>
+        </w:rPr>
+        <w:t>Étudiant Data Science · Je construis GetShift, un assistant de productivité IA 🧩</w:t>
+      </w:r>
+    </w:p>
+    <w:p>
+      <w:pPr>
+        <w:pStyle w:val="ListBullet"/>
+      </w:pPr>
+      <w:r>
+        <w:t xml:space="preserve">[ ] </w:t>
+      </w:r>
+      <w:r>
+        <w:rPr>
+          <w:b/>
+        </w:rPr>
+        <w:t>Section Infos</w:t>
+      </w:r>
+      <w:r>
+        <w:t xml:space="preserve"> (3-4 lignes) : qui tu es, ce que tu construis, pourquoi, le lien </w:t>
       </w:r>
       <w:r>
         <w:rPr>
@@ -208,10 +233,10 @@
         <w:rPr>
           <w:b/>
         </w:rPr>
-        <w:t>Lien en vedette</w:t>
+        <w:t>Lien en vedette (Featured)</w:t>
       </w:r>
       <w:r>
-        <w:t xml:space="preserve"> (Featured) : pointe vers </w:t>
+        <w:t xml:space="preserve"> → </w:t>
       </w:r>
       <w:r>
         <w:rPr>
@@ -229,16 +254,28 @@
         <w:pStyle w:val="ListBullet"/>
       </w:pPr>
       <w:r>
-        <w:t xml:space="preserve">[ ] Prépare </w:t>
+        <w:t xml:space="preserve">[ ] Activer le </w:t>
       </w:r>
       <w:r>
         <w:rPr>
           <w:b/>
         </w:rPr>
-        <w:t>3-4 visuels</w:t>
+        <w:t>mode créateur</w:t>
       </w:r>
       <w:r>
-        <w:t xml:space="preserve"> : capture du Dashboard, du Tomorrow Builder, de l'assistant IA en action (GIF court si possible). Le visuel double la portée.</w:t>
+        <w:t xml:space="preserve"> (LinkedIn → réglages) : ça met un bouton « Suivre » en avant.</w:t>
+      </w:r>
+    </w:p>
+    <w:p>
+      <w:pPr>
+        <w:ind w:left="360"/>
+      </w:pPr>
+      <w:r>
+        <w:rPr>
+          <w:i/>
+          <w:color w:val="555555"/>
+        </w:rPr>
+        <w:t>Règle : ton profil doit répondre en 3 secondes à « c'est qui, et pourquoi je le suis ? ».</w:t>
       </w:r>
     </w:p>
     <w:p>
@@ -254,12 +291,307 @@
         <w:pStyle w:val="Heading2"/>
       </w:pPr>
       <w:r>
-        <w:t>2. La règle d'or du format LinkedIn</w:t>
+        <w:t>ÉTAPE 1 — Construire les 100 premières connexions (semaine 1-2)</w:t>
       </w:r>
     </w:p>
     <w:p>
       <w:r>
-        <w:t>Chaque post suit cette structure :</w:t>
+        <w:t>C'est l'étape que 90% des gens sautent — et c'est LA plus importante quand on part de 0.</w:t>
+      </w:r>
+    </w:p>
+    <w:p>
+      <w:r>
+        <w:rPr>
+          <w:b/>
+        </w:rPr>
+        <w:t>Chaque jour, envoie 10-15 invitations</w:t>
+      </w:r>
+      <w:r>
+        <w:t xml:space="preserve"> ciblées (LinkedIn en limite ~100-200/semaine) à :</w:t>
+      </w:r>
+    </w:p>
+    <w:p>
+      <w:pPr>
+        <w:pStyle w:val="ListBullet"/>
+      </w:pPr>
+      <w:r>
+        <w:t xml:space="preserve">Tes </w:t>
+      </w:r>
+      <w:r>
+        <w:rPr>
+          <w:b/>
+        </w:rPr>
+        <w:t>camarades de classe / promo / école</w:t>
+      </w:r>
+      <w:r>
+        <w:t xml:space="preserve"> (Sèmè City inclus).</w:t>
+      </w:r>
+    </w:p>
+    <w:p>
+      <w:pPr>
+        <w:pStyle w:val="ListBullet"/>
+      </w:pPr>
+      <w:r>
+        <w:t xml:space="preserve">D'autres </w:t>
+      </w:r>
+      <w:r>
+        <w:rPr>
+          <w:b/>
+        </w:rPr>
+        <w:t>étudiants en tech/data</w:t>
+      </w:r>
+      <w:r>
+        <w:t xml:space="preserve"> (cherche « étudiant data science », « étudiant développeur »).</w:t>
+      </w:r>
+    </w:p>
+    <w:p>
+      <w:pPr>
+        <w:pStyle w:val="ListBullet"/>
+      </w:pPr>
+      <w:r>
+        <w:t xml:space="preserve">Des gens qui parlent de </w:t>
+      </w:r>
+      <w:r>
+        <w:rPr>
+          <w:b/>
+        </w:rPr>
+        <w:t>productivité, no-code, IA, entrepreneuriat étudiant</w:t>
+      </w:r>
+      <w:r>
+        <w:t>.</w:t>
+      </w:r>
+    </w:p>
+    <w:p>
+      <w:pPr>
+        <w:pStyle w:val="ListBullet"/>
+      </w:pPr>
+      <w:r>
+        <w:t xml:space="preserve">La </w:t>
+      </w:r>
+      <w:r>
+        <w:rPr>
+          <w:b/>
+        </w:rPr>
+        <w:t>communauté tech francophone / Afrique francophone</w:t>
+      </w:r>
+      <w:r>
+        <w:t xml:space="preserve"> (très accueillante, peu saturée).</w:t>
+      </w:r>
+    </w:p>
+    <w:p>
+      <w:r>
+        <w:rPr>
+          <w:b/>
+        </w:rPr>
+        <w:t>Toujours avec une note courte et personnalisée</w:t>
+      </w:r>
+      <w:r>
+        <w:t xml:space="preserve"> (pas l'invitation vide) :</w:t>
+      </w:r>
+    </w:p>
+    <w:p>
+      <w:pPr>
+        <w:ind w:left="360"/>
+      </w:pPr>
+      <w:r>
+        <w:rPr>
+          <w:i/>
+          <w:color w:val="555555"/>
+        </w:rPr>
+        <w:t>« Salut [prénom], je suis étudiant en data science et je construis une app IA de productivité. Je me connecte avec des gens du milieu — au plaisir d'échanger ! »</w:t>
+      </w:r>
+    </w:p>
+    <w:p>
+      <w:r>
+        <w:t xml:space="preserve">Objectif fin de semaine 2 : </w:t>
+      </w:r>
+      <w:r>
+        <w:rPr>
+          <w:b/>
+        </w:rPr>
+        <w:t>100-200 connexions</w:t>
+      </w:r>
+      <w:r>
+        <w:t>. C'est ta première vraie audience.</w:t>
+      </w:r>
+    </w:p>
+    <w:p>
+      <w:pPr>
+        <w:jc w:val="center"/>
+      </w:pPr>
+      <w:r>
+        <w:t>────────────────────────────────────────</w:t>
+      </w:r>
+    </w:p>
+    <w:p>
+      <w:pPr>
+        <w:pStyle w:val="Heading2"/>
+      </w:pPr>
+      <w:r>
+        <w:t>ÉTAPE 2 — Commenter pour exister (TOUS LES JOURS, dès le jour 1)</w:t>
+      </w:r>
+    </w:p>
+    <w:p>
+      <w:r>
+        <w:t>C'est ton plus gros levier de visibilité quand tu n'as pas d'audience.</w:t>
+      </w:r>
+    </w:p>
+    <w:p>
+      <w:pPr>
+        <w:pStyle w:val="ListBullet"/>
+      </w:pPr>
+      <w:r>
+        <w:rPr>
+          <w:b/>
+        </w:rPr>
+        <w:t>Commente 5-10 posts par jour</w:t>
+      </w:r>
+      <w:r>
+        <w:t xml:space="preserve"> de comptes plus gros (productivité, IA, tech, founders).</w:t>
+      </w:r>
+    </w:p>
+    <w:p>
+      <w:pPr>
+        <w:pStyle w:val="ListBullet"/>
+      </w:pPr>
+      <w:r>
+        <w:t xml:space="preserve">Pas « super post 👍 ». Apporte de la </w:t>
+      </w:r>
+      <w:r>
+        <w:rPr>
+          <w:b/>
+        </w:rPr>
+        <w:t>valeur</w:t>
+      </w:r>
+      <w:r>
+        <w:t xml:space="preserve"> : une idée, une expérience, une question.</w:t>
+      </w:r>
+    </w:p>
+    <w:p>
+      <w:pPr>
+        <w:pStyle w:val="ListBullet"/>
+      </w:pPr>
+      <w:r>
+        <w:t>Les gens qui lisent ton commentaire intelligent vont sur ton profil → s'abonnent.</w:t>
+      </w:r>
+    </w:p>
+    <w:p>
+      <w:pPr>
+        <w:pStyle w:val="ListBullet"/>
+      </w:pPr>
+      <w:r>
+        <w:rPr>
+          <w:b/>
+        </w:rPr>
+        <w:t>C'est gratuit, ça marche immédiatement, et ça ne dépend pas de ton nombre d'abonnés.</w:t>
+      </w:r>
+    </w:p>
+    <w:p>
+      <w:pPr>
+        <w:ind w:left="360"/>
+      </w:pPr>
+      <w:r>
+        <w:rPr>
+          <w:i/>
+          <w:color w:val="555555"/>
+        </w:rPr>
+        <w:t>Concrètement : 30 min/jour de commentaires pertinents &gt; 1 post parfait par semaine.</w:t>
+      </w:r>
+    </w:p>
+    <w:p>
+      <w:pPr>
+        <w:jc w:val="center"/>
+      </w:pPr>
+      <w:r>
+        <w:t>────────────────────────────────────────</w:t>
+      </w:r>
+    </w:p>
+    <w:p>
+      <w:pPr>
+        <w:pStyle w:val="Heading2"/>
+      </w:pPr>
+      <w:r>
+        <w:t>ÉTAPE 3 — Activer ton réseau réel (semaine 1)</w:t>
+      </w:r>
+    </w:p>
+    <w:p>
+      <w:r>
+        <w:t>Tu as déjà une audience hors LinkedIn — utilise-la pour amorcer :</w:t>
+      </w:r>
+    </w:p>
+    <w:p>
+      <w:pPr>
+        <w:pStyle w:val="ListBullet"/>
+      </w:pPr>
+      <w:r>
+        <w:rPr>
+          <w:b/>
+        </w:rPr>
+        <w:t>WhatsApp / Instagram</w:t>
+      </w:r>
+      <w:r>
+        <w:t xml:space="preserve"> : « J'ai lancé mon app, mon premier post LinkedIn est là, un like/partage m'aiderait énormément 🙏 » + le lien.</w:t>
+      </w:r>
+    </w:p>
+    <w:p>
+      <w:pPr>
+        <w:pStyle w:val="ListBullet"/>
+      </w:pPr>
+      <w:r>
+        <w:rPr>
+          <w:b/>
+        </w:rPr>
+        <w:t>Tes profs, ta promo, Sèmè City</w:t>
+      </w:r>
+      <w:r>
+        <w:t xml:space="preserve"> : demande-leur de se connecter et de réagir à ton 1er post.</w:t>
+      </w:r>
+    </w:p>
+    <w:p>
+      <w:pPr>
+        <w:pStyle w:val="ListBullet"/>
+      </w:pPr>
+      <w:r>
+        <w:t xml:space="preserve">Les </w:t>
+      </w:r>
+      <w:r>
+        <w:rPr>
+          <w:b/>
+        </w:rPr>
+        <w:t>20 premières réactions</w:t>
+      </w:r>
+      <w:r>
+        <w:t xml:space="preserve"> d'un post viennent presque toujours de ton réseau réel. C'est ce qui dit à LinkedIn « ce post est intéressant » → il le montre à d'autres.</w:t>
+      </w:r>
+    </w:p>
+    <w:p>
+      <w:pPr>
+        <w:jc w:val="center"/>
+      </w:pPr>
+      <w:r>
+        <w:t>────────────────────────────────────────</w:t>
+      </w:r>
+    </w:p>
+    <w:p>
+      <w:pPr>
+        <w:pStyle w:val="Heading2"/>
+      </w:pPr>
+      <w:r>
+        <w:t>ÉTAPE 4 — Poster (3×/semaine), même devant peu de monde</w:t>
+      </w:r>
+    </w:p>
+    <w:p>
+      <w:r>
+        <w:t xml:space="preserve">Maintenant seulement les posts prennent du sens. </w:t>
+      </w:r>
+      <w:r>
+        <w:rPr>
+          <w:b/>
+        </w:rPr>
+        <w:t>3 posts/semaine</w:t>
+      </w:r>
+      <w:r>
+        <w:t>, format :</w:t>
       </w:r>
     </w:p>
     <w:p>
@@ -273,7 +605,7 @@
         <w:t>Accroche</w:t>
       </w:r>
       <w:r>
-        <w:t xml:space="preserve"> (1ʳᵉ ligne = tout) : une phrase qui stoppe le scroll.</w:t>
+        <w:t xml:space="preserve"> (1ʳᵉ ligne = tout).</w:t>
       </w:r>
     </w:p>
     <w:p>
@@ -281,13 +613,7 @@
         <w:pStyle w:val="ListNumber"/>
       </w:pPr>
       <w:r>
-        <w:rPr>
-          <w:b/>
-        </w:rPr>
-        <w:t>Saut de ligne</w:t>
-      </w:r>
-      <w:r>
-        <w:t xml:space="preserve">, puis le corps en </w:t>
+        <w:t xml:space="preserve">Corps en </w:t>
       </w:r>
       <w:r>
         <w:rPr>
@@ -307,10 +633,19 @@
         <w:rPr>
           <w:b/>
         </w:rPr>
-        <w:t>1 idée par post.</w:t>
+        <w:t>1 idée par post</w:t>
       </w:r>
       <w:r>
-        <w:t xml:space="preserve"> Pas de pavé.</w:t>
+        <w:t xml:space="preserve"> + une </w:t>
+      </w:r>
+      <w:r>
+        <w:rPr>
+          <w:b/>
+        </w:rPr>
+        <w:t>question finale</w:t>
+      </w:r>
+      <w:r>
+        <w:t xml:space="preserve"> (déclenche les commentaires).</w:t>
       </w:r>
     </w:p>
     <w:p>
@@ -321,10 +656,18 @@
         <w:rPr>
           <w:b/>
         </w:rPr>
-        <w:t>Une question finale</w:t>
+        <w:t>Le lien `usegetshift.com` en 1ᵉʳ COMMENTAIRE</w:t>
       </w:r>
       <w:r>
-        <w:t xml:space="preserve"> pour déclencher les commentaires.</w:t>
+        <w:t>, jamais dans le post.</w:t>
+      </w:r>
+    </w:p>
+    <w:p>
+      <w:pPr>
+        <w:pStyle w:val="ListNumber"/>
+      </w:pPr>
+      <w:r>
+        <w:t>3-5 hashtags : #buildinpublic #productivité #IA #startup</w:t>
       </w:r>
     </w:p>
     <w:p>
@@ -335,24 +678,10 @@
         <w:rPr>
           <w:b/>
         </w:rPr>
-        <w:t>3-5 hashtags</w:t>
+        <w:t>Réponds à CHAQUE commentaire dans l'heure</w:t>
       </w:r>
       <w:r>
-        <w:t xml:space="preserve"> max en bas (#productivité #IA #buildinpublic #startup #SaaS).</w:t>
-      </w:r>
-    </w:p>
-    <w:p>
-      <w:pPr>
-        <w:pStyle w:val="ListNumber"/>
-      </w:pPr>
-      <w:r>
-        <w:rPr>
-          <w:b/>
-        </w:rPr>
-        <w:t>Le lien `usegetshift.com` en COMMENTAIRE</w:t>
-      </w:r>
-      <w:r>
-        <w:t>, pas dans le post (LinkedIn pénalise les liens externes dans le corps → mets-le en 1ᵉʳ commentaire).</w:t>
+        <w:t xml:space="preserve"> → booste la portée.</w:t>
       </w:r>
     </w:p>
     <w:p>
@@ -360,37 +689,22 @@
         <w:rPr>
           <w:b/>
         </w:rPr>
-        <w:t>Quand poster :</w:t>
+        <w:t>Heure</w:t>
       </w:r>
       <w:r>
-        <w:t xml:space="preserve"> mar/mer/jeu, </w:t>
+        <w:t xml:space="preserve"> : mar/mer/jeu, 7h30-8h30 ou 12h-13h.</w:t>
       </w:r>
+    </w:p>
+    <w:p>
+      <w:pPr>
+        <w:ind w:left="360"/>
+      </w:pPr>
       <w:r>
         <w:rPr>
-          <w:b/>
+          <w:i/>
+          <w:color w:val="555555"/>
         </w:rPr>
-        <w:t>7h30–8h30</w:t>
-      </w:r>
-      <w:r>
-        <w:t xml:space="preserve"> ou </w:t>
-      </w:r>
-      <w:r>
-        <w:rPr>
-          <w:b/>
-        </w:rPr>
-        <w:t>12h–13h</w:t>
-      </w:r>
-      <w:r>
-        <w:t xml:space="preserve"> (heure de ton audience). Réponds à </w:t>
-      </w:r>
-      <w:r>
-        <w:rPr>
-          <w:b/>
-        </w:rPr>
-        <w:t>tous</w:t>
-      </w:r>
-      <w:r>
-        <w:t xml:space="preserve"> les commentaires dans l'heure → ça booste la portée.</w:t>
+        <w:t>Ne te décourage pas si un post fait 50 vues. Au début c'est normal. La régularité + les étapes 1-2-3 font monter la moyenne semaine après semaine.</w:t>
       </w:r>
     </w:p>
     <w:p>
@@ -406,233 +720,317 @@
         <w:pStyle w:val="Heading2"/>
       </w:pPr>
       <w:r>
-        <w:t>3. Le calendrier (4 semaines pour démarrer)</w:t>
+        <w:t>Calendrier réaliste — les 4 premières semaines</w:t>
       </w:r>
     </w:p>
+    <w:tbl>
+      <w:tblPr>
+        <w:tblStyle w:val="LightGrid-Accent2"/>
+        <w:tblW w:type="auto" w:w="0"/>
+        <w:tblLook w:firstColumn="1" w:firstRow="1" w:lastColumn="0" w:lastRow="0" w:noHBand="0" w:noVBand="1" w:val="04A0"/>
+      </w:tblPr>
+      <w:tblGrid>
+        <w:gridCol w:w="1728"/>
+        <w:gridCol w:w="1728"/>
+        <w:gridCol w:w="1728"/>
+        <w:gridCol w:w="1728"/>
+        <w:gridCol w:w="1728"/>
+      </w:tblGrid>
+      <w:tr>
+        <w:tc>
+          <w:tcPr>
+            <w:tcW w:type="dxa" w:w="1728"/>
+          </w:tcPr>
+          <w:p>
+            <w:r>
+              <w:rPr>
+                <w:b/>
+              </w:rPr>
+              <w:t>Semaine</w:t>
+            </w:r>
+          </w:p>
+        </w:tc>
+        <w:tc>
+          <w:tcPr>
+            <w:tcW w:type="dxa" w:w="1728"/>
+          </w:tcPr>
+          <w:p>
+            <w:r>
+              <w:rPr>
+                <w:b/>
+              </w:rPr>
+              <w:t>Connexions/jour</w:t>
+            </w:r>
+          </w:p>
+        </w:tc>
+        <w:tc>
+          <w:tcPr>
+            <w:tcW w:type="dxa" w:w="1728"/>
+          </w:tcPr>
+          <w:p>
+            <w:r>
+              <w:rPr>
+                <w:b/>
+              </w:rPr>
+              <w:t>Commentaires/jour</w:t>
+            </w:r>
+          </w:p>
+        </w:tc>
+        <w:tc>
+          <w:tcPr>
+            <w:tcW w:type="dxa" w:w="1728"/>
+          </w:tcPr>
+          <w:p>
+            <w:r>
+              <w:rPr>
+                <w:b/>
+              </w:rPr>
+              <w:t>Posts</w:t>
+            </w:r>
+          </w:p>
+        </w:tc>
+        <w:tc>
+          <w:tcPr>
+            <w:tcW w:type="dxa" w:w="1728"/>
+          </w:tcPr>
+          <w:p>
+            <w:r>
+              <w:rPr>
+                <w:b/>
+              </w:rPr>
+              <w:t>Focus</w:t>
+            </w:r>
+          </w:p>
+        </w:tc>
+      </w:tr>
+      <w:tr>
+        <w:tc>
+          <w:tcPr>
+            <w:tcW w:type="dxa" w:w="1728"/>
+          </w:tcPr>
+          <w:p>
+            <w:r>
+              <w:t>1</w:t>
+            </w:r>
+          </w:p>
+        </w:tc>
+        <w:tc>
+          <w:tcPr>
+            <w:tcW w:type="dxa" w:w="1728"/>
+          </w:tcPr>
+          <w:p>
+            <w:r>
+              <w:t>10-15</w:t>
+            </w:r>
+          </w:p>
+        </w:tc>
+        <w:tc>
+          <w:tcPr>
+            <w:tcW w:type="dxa" w:w="1728"/>
+          </w:tcPr>
+          <w:p>
+            <w:r>
+              <w:t>5</w:t>
+            </w:r>
+          </w:p>
+        </w:tc>
+        <w:tc>
+          <w:tcPr>
+            <w:tcW w:type="dxa" w:w="1728"/>
+          </w:tcPr>
+          <w:p>
+            <w:r>
+              <w:t>1 (lancement, cf. modèle A)</w:t>
+            </w:r>
+          </w:p>
+        </w:tc>
+        <w:tc>
+          <w:tcPr>
+            <w:tcW w:type="dxa" w:w="1728"/>
+          </w:tcPr>
+          <w:p>
+            <w:r>
+              <w:t>Profil + amorcer le réseau réel</w:t>
+            </w:r>
+          </w:p>
+        </w:tc>
+      </w:tr>
+      <w:tr>
+        <w:tc>
+          <w:tcPr>
+            <w:tcW w:type="dxa" w:w="1728"/>
+          </w:tcPr>
+          <w:p>
+            <w:r>
+              <w:t>2</w:t>
+            </w:r>
+          </w:p>
+        </w:tc>
+        <w:tc>
+          <w:tcPr>
+            <w:tcW w:type="dxa" w:w="1728"/>
+          </w:tcPr>
+          <w:p>
+            <w:r>
+              <w:t>10-15</w:t>
+            </w:r>
+          </w:p>
+        </w:tc>
+        <w:tc>
+          <w:tcPr>
+            <w:tcW w:type="dxa" w:w="1728"/>
+          </w:tcPr>
+          <w:p>
+            <w:r>
+              <w:t>5-10</w:t>
+            </w:r>
+          </w:p>
+        </w:tc>
+        <w:tc>
+          <w:tcPr>
+            <w:tcW w:type="dxa" w:w="1728"/>
+          </w:tcPr>
+          <w:p>
+            <w:r>
+              <w:t>2</w:t>
+            </w:r>
+          </w:p>
+        </w:tc>
+        <w:tc>
+          <w:tcPr>
+            <w:tcW w:type="dxa" w:w="1728"/>
+          </w:tcPr>
+          <w:p>
+            <w:r>
+              <w:t>Atteindre 100-200 connexions</w:t>
+            </w:r>
+          </w:p>
+        </w:tc>
+      </w:tr>
+      <w:tr>
+        <w:tc>
+          <w:tcPr>
+            <w:tcW w:type="dxa" w:w="1728"/>
+          </w:tcPr>
+          <w:p>
+            <w:r>
+              <w:t>3</w:t>
+            </w:r>
+          </w:p>
+        </w:tc>
+        <w:tc>
+          <w:tcPr>
+            <w:tcW w:type="dxa" w:w="1728"/>
+          </w:tcPr>
+          <w:p>
+            <w:r>
+              <w:t>10</w:t>
+            </w:r>
+          </w:p>
+        </w:tc>
+        <w:tc>
+          <w:tcPr>
+            <w:tcW w:type="dxa" w:w="1728"/>
+          </w:tcPr>
+          <w:p>
+            <w:r>
+              <w:t>10</w:t>
+            </w:r>
+          </w:p>
+        </w:tc>
+        <w:tc>
+          <w:tcPr>
+            <w:tcW w:type="dxa" w:w="1728"/>
+          </w:tcPr>
+          <w:p>
+            <w:r>
+              <w:t>3</w:t>
+            </w:r>
+          </w:p>
+        </w:tc>
+        <w:tc>
+          <w:tcPr>
+            <w:tcW w:type="dxa" w:w="1728"/>
+          </w:tcPr>
+          <w:p>
+            <w:r>
+              <w:t>Les posts commencent à porter</w:t>
+            </w:r>
+          </w:p>
+        </w:tc>
+      </w:tr>
+      <w:tr>
+        <w:tc>
+          <w:tcPr>
+            <w:tcW w:type="dxa" w:w="1728"/>
+          </w:tcPr>
+          <w:p>
+            <w:r>
+              <w:t>4</w:t>
+            </w:r>
+          </w:p>
+        </w:tc>
+        <w:tc>
+          <w:tcPr>
+            <w:tcW w:type="dxa" w:w="1728"/>
+          </w:tcPr>
+          <w:p>
+            <w:r>
+              <w:t>5-10</w:t>
+            </w:r>
+          </w:p>
+        </w:tc>
+        <w:tc>
+          <w:tcPr>
+            <w:tcW w:type="dxa" w:w="1728"/>
+          </w:tcPr>
+          <w:p>
+            <w:r>
+              <w:t>10</w:t>
+            </w:r>
+          </w:p>
+        </w:tc>
+        <w:tc>
+          <w:tcPr>
+            <w:tcW w:type="dxa" w:w="1728"/>
+          </w:tcPr>
+          <w:p>
+            <w:r>
+              <w:t>3</w:t>
+            </w:r>
+          </w:p>
+        </w:tc>
+        <w:tc>
+          <w:tcPr>
+            <w:tcW w:type="dxa" w:w="1728"/>
+          </w:tcPr>
+          <w:p>
+            <w:r>
+              <w:t>Mesurer, refaire ce qui marche</w:t>
+            </w:r>
+          </w:p>
+        </w:tc>
+      </w:tr>
+    </w:tbl>
+    <w:p/>
     <w:p>
-      <w:pPr>
-        <w:pStyle w:val="Heading3"/>
-      </w:pPr>
-      <w:r>
-        <w:t>Semaine 1 — Le lancement</w:t>
-      </w:r>
-    </w:p>
-    <w:p>
-      <w:pPr>
-        <w:pStyle w:val="ListBullet"/>
-      </w:pPr>
       <w:r>
         <w:rPr>
           <w:b/>
         </w:rPr>
-        <w:t>Jour 1 (Post de lancement)</w:t>
+        <w:t>Objectif honnête mois 1</w:t>
       </w:r>
       <w:r>
-        <w:t xml:space="preserve"> : tu annonces GetShift. (Modèle A ci-dessous.)</w:t>
+        <w:t xml:space="preserve"> : 200-400 connexions, une habitude installée, et tes premiers vrais retours sur GetShift. Pas la viralité — la </w:t>
       </w:r>
-    </w:p>
-    <w:p>
-      <w:pPr>
-        <w:pStyle w:val="ListBullet"/>
-      </w:pPr>
       <w:r>
         <w:rPr>
           <w:b/>
         </w:rPr>
-        <w:t>Jour 3 (Le pourquoi)</w:t>
+        <w:t>fondation</w:t>
       </w:r>
       <w:r>
-        <w:t xml:space="preserve"> : l'histoire — pourquoi tu l'as construit. (Modèle B.)</w:t>
-      </w:r>
-    </w:p>
-    <w:p>
-      <w:pPr>
-        <w:pStyle w:val="ListBullet"/>
-      </w:pPr>
-      <w:r>
-        <w:rPr>
-          <w:b/>
-        </w:rPr>
-        <w:t>Jour 5 (Démo)</w:t>
-      </w:r>
-      <w:r>
-        <w:t xml:space="preserve"> : une fonctionnalité en GIF/vidéo (l'IA qui crée une tâche, ou Tomorrow Builder). (Modèle C.)</w:t>
-      </w:r>
-    </w:p>
-    <w:p>
-      <w:pPr>
-        <w:pStyle w:val="Heading3"/>
-      </w:pPr>
-      <w:r>
-        <w:t>Semaine 2 — La valeur</w:t>
-      </w:r>
-    </w:p>
-    <w:p>
-      <w:pPr>
-        <w:pStyle w:val="ListBullet"/>
-      </w:pPr>
-      <w:r>
-        <w:rPr>
-          <w:b/>
-        </w:rPr>
-        <w:t>Coulisses</w:t>
-      </w:r>
-      <w:r>
-        <w:t xml:space="preserve"> : un truc qui a cassé + comment tu l'as réparé (build in public).</w:t>
-      </w:r>
-    </w:p>
-    <w:p>
-      <w:pPr>
-        <w:pStyle w:val="ListBullet"/>
-      </w:pPr>
-      <w:r>
-        <w:rPr>
-          <w:b/>
-        </w:rPr>
-        <w:t>Astuce productivité</w:t>
-      </w:r>
-      <w:r>
-        <w:t xml:space="preserve"> : un conseil utile SANS vendre (tu donnes, tu donnes, puis tu demandes).</w:t>
-      </w:r>
-    </w:p>
-    <w:p>
-      <w:pPr>
-        <w:pStyle w:val="ListBullet"/>
-      </w:pPr>
-      <w:r>
-        <w:rPr>
-          <w:b/>
-        </w:rPr>
-        <w:t>Une fonction unique</w:t>
-      </w:r>
-      <w:r>
-        <w:t xml:space="preserve"> : Goal Reverse — « transforme un objectif en plan ».</w:t>
-      </w:r>
-    </w:p>
-    <w:p>
-      <w:pPr>
-        <w:pStyle w:val="Heading3"/>
-      </w:pPr>
-      <w:r>
-        <w:t>Semaine 3 — La preuve</w:t>
-      </w:r>
-    </w:p>
-    <w:p>
-      <w:pPr>
-        <w:pStyle w:val="ListBullet"/>
-      </w:pPr>
-      <w:r>
-        <w:rPr>
-          <w:b/>
-        </w:rPr>
-        <w:t>Premiers retours</w:t>
-      </w:r>
-      <w:r>
-        <w:t xml:space="preserve"> d'utilisateurs (captures de messages, citations).</w:t>
-      </w:r>
-    </w:p>
-    <w:p>
-      <w:pPr>
-        <w:pStyle w:val="ListBullet"/>
-      </w:pPr>
-      <w:r>
-        <w:rPr>
-          <w:b/>
-        </w:rPr>
-        <w:t>Un chiffre</w:t>
-      </w:r>
-      <w:r>
-        <w:t xml:space="preserve"> : « X personnes ont rejoint cette semaine » (même petit, l'honnêteté plaît).</w:t>
-      </w:r>
-    </w:p>
-    <w:p>
-      <w:pPr>
-        <w:pStyle w:val="ListBullet"/>
-      </w:pPr>
-      <w:r>
-        <w:rPr>
-          <w:b/>
-        </w:rPr>
-        <w:t>Sondage</w:t>
-      </w:r>
-      <w:r>
-        <w:t xml:space="preserve"> : « Quel est ton plus gros frein à la productivité ? » (engagement max).</w:t>
-      </w:r>
-    </w:p>
-    <w:p>
-      <w:pPr>
-        <w:pStyle w:val="Heading3"/>
-      </w:pPr>
-      <w:r>
-        <w:t>Semaine 4 — L'appel</w:t>
-      </w:r>
-    </w:p>
-    <w:p>
-      <w:pPr>
-        <w:pStyle w:val="ListBullet"/>
-      </w:pPr>
-      <w:r>
-        <w:rPr>
-          <w:b/>
-        </w:rPr>
-        <w:t>Le récap</w:t>
-      </w:r>
-      <w:r>
-        <w:t xml:space="preserve"> : ce que tu as appris en 1 mois de build in public.</w:t>
-      </w:r>
-    </w:p>
-    <w:p>
-      <w:pPr>
-        <w:pStyle w:val="ListBullet"/>
-      </w:pPr>
-      <w:r>
-        <w:rPr>
-          <w:b/>
-        </w:rPr>
-        <w:t>L'invitation claire</w:t>
-      </w:r>
-      <w:r>
-        <w:t xml:space="preserve"> : « Teste GetShift, dis-moi ce qui manque » + lien commentaire.</w:t>
-      </w:r>
-    </w:p>
-    <w:p>
-      <w:pPr>
-        <w:pStyle w:val="ListBullet"/>
-      </w:pPr>
-      <w:r>
-        <w:rPr>
-          <w:b/>
-        </w:rPr>
-        <w:t>Demande d'aide</w:t>
-      </w:r>
-      <w:r>
-        <w:t xml:space="preserve"> : « Tu connais un étudiant/pro qui se noie sous les tâches ? Tag-le. »</w:t>
-      </w:r>
-    </w:p>
-    <w:p>
-      <w:pPr>
-        <w:ind w:left="360"/>
-      </w:pPr>
-      <w:r>
-        <w:rPr>
-          <w:i/>
-          <w:color w:val="555555"/>
-        </w:rPr>
-        <w:t xml:space="preserve">Rythme tenable : </w:t>
-      </w:r>
-      <w:r>
-        <w:rPr>
-          <w:b/>
-          <w:i/>
-        </w:rPr>
-        <w:t>3 posts/semaine</w:t>
-      </w:r>
-      <w:r>
-        <w:rPr>
-          <w:i/>
-          <w:color w:val="555555"/>
-        </w:rPr>
-        <w:t>. Mieux vaut 3 réguliers que 7 puis plus rien.</w:t>
+        <w:t>.</w:t>
       </w:r>
     </w:p>
     <w:p>
@@ -648,7 +1046,7 @@
         <w:pStyle w:val="Heading2"/>
       </w:pPr>
       <w:r>
-        <w:t>4. Modèles de posts (à adapter, pas à copier mot pour mot)</w:t>
+        <w:t>Modèles de posts (à adapter, pas copier mot pour mot)</w:t>
       </w:r>
     </w:p>
     <w:p>
@@ -669,7 +1067,7 @@
           <w:color w:val="333333"/>
           <w:sz w:val="19"/>
         </w:rPr>
-        <w:t>J'ai 0 employé, je suis étudiant, et je viens de lancer mon app.</w:t>
+        <w:t>J'ai 17 ans, je suis étudiant, et je viens de lancer mon app. Seul.</w:t>
         <w:br/>
         <w:br/>
         <w:t>Elle s'appelle GetShift.</w:t>
@@ -686,15 +1084,10 @@
         <w:t>→ et te relance quand tu lâches</w:t>
         <w:br/>
         <w:br/>
-        <w:t>Je l'ai construite parce que j'en avais marre des apps qui te donnent une liste</w:t>
-        <w:br/>
-        <w:t>vide et te laissent te débrouiller.</w:t>
+        <w:t>Je la construis en public. Voici le début 👇</w:t>
         <w:br/>
         <w:br/>
-        <w:t>C'est gratuit. 6 langues. Sur web et mobile.</w:t>
-        <w:br/>
-        <w:br/>
-        <w:t>👇 Le lien est en commentaire. Dis-moi franchement ce que tu en penses.</w:t>
+        <w:t>(Le lien est en commentaire. Dis-moi franchement ce que tu en penses.)</w:t>
         <w:br/>
         <w:br/>
         <w:t>#buildinpublic #productivité #IA #startup</w:t>
@@ -705,7 +1098,7 @@
         <w:pStyle w:val="Heading3"/>
       </w:pPr>
       <w:r>
-        <w:t>Modèle B — Le pourquoi (l'histoire)</w:t>
+        <w:t>Modèle B — L'histoire (le pourquoi)</w:t>
       </w:r>
     </w:p>
     <w:p>
@@ -718,9 +1111,7 @@
           <w:color w:val="333333"/>
           <w:sz w:val="19"/>
         </w:rPr>
-        <w:t>Il y a quelques mois, je ratais des deadlines alors que j'avais une to-do list</w:t>
-        <w:br/>
-        <w:t>remplie.</w:t>
+        <w:t>Je ratais des deadlines alors que ma to-do list était pleine.</w:t>
         <w:br/>
         <w:br/>
         <w:t>Le problème n'était pas la liste. C'était que personne ne m'aidait à DÉCIDER</w:t>
@@ -728,16 +1119,16 @@
         <w:t>quoi faire, ni à tenir.</w:t>
         <w:br/>
         <w:br/>
-        <w:t>Alors j'ai commencé à coder GetShift. Seul. La nuit, entre les cours.</w:t>
+        <w:t>Alors j'ai commencé à coder GetShift. La nuit, entre les cours.</w:t>
         <w:br/>
         <w:br/>
         <w:t>Aujourd'hui l'IA y planifie ma journée et me relance comme un coach.</w:t>
         <w:br/>
         <w:br/>
-        <w:t>Je le construis en public. Voici la suite 👇</w:t>
+        <w:t>C'est quoi, TON plus gros frein à la productivité ?</w:t>
         <w:br/>
         <w:br/>
-        <w:t>#buildinpublic #data #étudiant</w:t>
+        <w:t>#buildinpublic #étudiant</w:t>
       </w:r>
     </w:p>
     <w:p>
@@ -745,7 +1136,7 @@
         <w:pStyle w:val="Heading3"/>
       </w:pPr>
       <w:r>
-        <w:t>Modèle C — Démo d'une fonction</w:t>
+        <w:t>Modèle C — Démo (l'IA qui agit)</w:t>
       </w:r>
     </w:p>
     <w:p>
@@ -758,56 +1149,16 @@
           <w:color w:val="333333"/>
           <w:sz w:val="19"/>
         </w:rPr>
-        <w:t>« Range mes tâches de demain selon mon énergie. »</w:t>
+        <w:t>J'ai donné à mon app mon propre plan business en PDF.</w:t>
         <w:br/>
         <w:br/>
-        <w:t>J'ai tapé ça dans GetShift. Voici ce qui s'est passé 👇 [GIF]</w:t>
+        <w:t>Elle l'a découpé en tâches datées en 10 secondes. 👇 [capture/vidéo]</w:t>
         <w:br/>
         <w:br/>
-        <w:t>L'IA ne m'a pas répondu un texte.</w:t>
-        <w:br/>
-        <w:t>Elle a CONSTRUIT mon planning : tâches dures le matin (mon pic), admin l'après-midi.</w:t>
+        <w:t>Je voulais une IA qui AGIT, pas qui répond un texte.</w:t>
         <w:br/>
         <w:br/>
-        <w:t>C'est ça que je voulais : une IA qui agit, pas qui bavarde.</w:t>
-        <w:br/>
-        <w:br/>
-        <w:t>Tu planifies comment, toi ? À l'instinct ou avec un système ?</w:t>
-      </w:r>
-    </w:p>
-    <w:p>
-      <w:pPr>
-        <w:pStyle w:val="Heading3"/>
-      </w:pPr>
-      <w:r>
-        <w:t>Modèle D — Build in public / vulnérabilité</w:t>
-      </w:r>
-    </w:p>
-    <w:p>
-      <w:pPr>
-        <w:ind w:left="240"/>
-      </w:pPr>
-      <w:r>
-        <w:rPr>
-          <w:rFonts w:ascii="Consolas" w:hAnsi="Consolas"/>
-          <w:color w:val="333333"/>
-          <w:sz w:val="19"/>
-        </w:rPr>
-        <w:t>Hier, mes notifications ne partaient plus depuis 100h. Personne ne s'en plaignait</w:t>
-        <w:br/>
-        <w:t>— parce que j'étais le seul à avoir activé les notifs 😅</w:t>
-        <w:br/>
-        <w:br/>
-        <w:t>Leçon : un bug silencieux est pire qu'un bug bruyant.</w:t>
-        <w:br/>
-        <w:br/>
-        <w:t>Je l'ai traqué, corrigé, et j'ai ajouté un bouton de test.</w:t>
-        <w:br/>
-        <w:br/>
-        <w:t>Construire seul, c'est ça : tu es le dev, le support, et le premier cobaye.</w:t>
-        <w:br/>
-        <w:br/>
-        <w:t>#buildinpublic</w:t>
+        <w:t>Tu planifies comment, toi — à l'instinct ou avec un système ?</w:t>
       </w:r>
     </w:p>
     <w:p>
@@ -823,7 +1174,7 @@
         <w:pStyle w:val="Heading2"/>
       </w:pPr>
       <w:r>
-        <w:t>5. Au-delà des posts (ce qui fait vraiment décoller)</w:t>
+        <w:t>Les 3 erreurs qui tuent un débutant</w:t>
       </w:r>
     </w:p>
     <w:p>
@@ -831,13 +1182,16 @@
         <w:pStyle w:val="ListBullet"/>
       </w:pPr>
       <w:r>
+        <w:t xml:space="preserve">❌ </w:t>
+      </w:r>
+      <w:r>
         <w:rPr>
           <w:b/>
         </w:rPr>
-        <w:t>Commente 5 posts/jour</w:t>
+        <w:t>Poster avant d'avoir un réseau.</w:t>
       </w:r>
       <w:r>
-        <w:t xml:space="preserve"> de comptes productivité/tech/étudiants. Ta visibilité vient AUSSI des commentaires des autres, pas que de tes posts.</w:t>
+        <w:t xml:space="preserve"> Tu parles dans le vide. Connexions + commentaires D'ABORD.</w:t>
       </w:r>
     </w:p>
     <w:p>
@@ -845,13 +1199,16 @@
         <w:pStyle w:val="ListBullet"/>
       </w:pPr>
       <w:r>
+        <w:t xml:space="preserve">❌ </w:t>
+      </w:r>
+      <w:r>
         <w:rPr>
           <w:b/>
         </w:rPr>
-        <w:t>DM doux</w:t>
+        <w:t>Invitations vides.</w:t>
       </w:r>
       <w:r>
-        <w:t xml:space="preserve"> : aux gens qui likent/commentent → « Merci ! Tu veux le tester ? J'adorerais ton retour. » (pas de spam, personnalisé.)</w:t>
+        <w:t xml:space="preserve"> Toujours une note → 3× plus d'acceptation.</w:t>
       </w:r>
     </w:p>
     <w:p>
@@ -859,164 +1216,70 @@
         <w:pStyle w:val="ListBullet"/>
       </w:pPr>
       <w:r>
-        <w:rPr>
-          <w:b/>
-        </w:rPr>
-        <w:t>Product Hunt</w:t>
-      </w:r>
-      <w:r>
-        <w:t xml:space="preserve"> : prépare un lancement (autre canal, gros pic de trafic + backlink SEO).</w:t>
-      </w:r>
-    </w:p>
-    <w:p>
-      <w:pPr>
-        <w:pStyle w:val="ListBullet"/>
-      </w:pPr>
-      <w:r>
-        <w:rPr>
-          <w:b/>
-        </w:rPr>
-        <w:t>Groupes / communautés</w:t>
-      </w:r>
-      <w:r>
-        <w:t xml:space="preserve"> étudiants &amp; productivité (FR + Afrique francophone).</w:t>
-      </w:r>
-    </w:p>
-    <w:p>
-      <w:pPr>
-        <w:pStyle w:val="ListBullet"/>
-      </w:pPr>
-      <w:r>
-        <w:rPr>
-          <w:b/>
-        </w:rPr>
-        <w:t>Réutilise</w:t>
-      </w:r>
-      <w:r>
-        <w:t xml:space="preserve"> : chaque post LinkedIn → aussi en story Instagram, en tweet, dans un groupe WhatsApp d'étudiants.</w:t>
-      </w:r>
-    </w:p>
-    <w:p>
-      <w:pPr>
-        <w:jc w:val="center"/>
-      </w:pPr>
-      <w:r>
-        <w:t>────────────────────────────────────────</w:t>
-      </w:r>
-    </w:p>
-    <w:p>
-      <w:pPr>
-        <w:pStyle w:val="Heading2"/>
-      </w:pPr>
-      <w:r>
-        <w:t>6. Mesurer (sans s'obséder)</w:t>
-      </w:r>
-    </w:p>
-    <w:p>
-      <w:r>
-        <w:t>Chaque dimanche, note 4 chiffres :</w:t>
-      </w:r>
-    </w:p>
-    <w:p>
-      <w:pPr>
-        <w:pStyle w:val="ListBullet"/>
-      </w:pPr>
-      <w:r>
-        <w:t xml:space="preserve">Nouveaux inscrits sur GetShift (visible dans </w:t>
+        <w:t xml:space="preserve">❌ </w:t>
       </w:r>
       <w:r>
         <w:rPr>
           <w:b/>
         </w:rPr>
-        <w:t>Console Fondateur → Croissance</w:t>
+        <w:t>Abandonner après 2 semaines</w:t>
       </w:r>
       <w:r>
-        <w:t>).</w:t>
+        <w:t xml:space="preserve"> parce que « ça ne marche pas ». À 0 audience, les 3-4 premières semaines sont lentes par nature. Ceux qui percent sont ceux qui restent.</w:t>
       </w:r>
     </w:p>
     <w:p>
       <w:pPr>
-        <w:pStyle w:val="ListBullet"/>
+        <w:ind w:left="360"/>
       </w:pPr>
       <w:r>
-        <w:t>Vues du meilleur post.</w:t>
+        <w:rPr>
+          <w:i/>
+          <w:color w:val="555555"/>
+        </w:rPr>
+        <w:t xml:space="preserve">Le secret n'est pas d'être connu. C'est d'être </w:t>
       </w:r>
-    </w:p>
-    <w:p>
-      <w:pPr>
-        <w:pStyle w:val="ListBullet"/>
-      </w:pPr>
       <w:r>
-        <w:t>Nouveaux abonnés LinkedIn.</w:t>
+        <w:rPr>
+          <w:b/>
+          <w:i/>
+        </w:rPr>
+        <w:t>constant</w:t>
       </w:r>
-    </w:p>
-    <w:p>
-      <w:pPr>
-        <w:pStyle w:val="ListBullet"/>
-      </w:pPr>
       <w:r>
-        <w:t>1 retour utilisateur marquant.</w:t>
+        <w:rPr>
+          <w:i/>
+          <w:color w:val="555555"/>
+        </w:rPr>
+        <w:t xml:space="preserve"> + </w:t>
       </w:r>
-    </w:p>
-    <w:p>
       <w:r>
-        <w:t>Si un type de post marche → refais-en. Si un autre tombe à plat → arrête. C'est tout.</w:t>
+        <w:rPr>
+          <w:b/>
+          <w:i/>
+        </w:rPr>
+        <w:t>utile dans les commentaires</w:t>
       </w:r>
-    </w:p>
-    <w:p>
-      <w:pPr>
-        <w:jc w:val="center"/>
-      </w:pPr>
       <w:r>
-        <w:t>────────────────────────────────────────</w:t>
+        <w:rPr>
+          <w:i/>
+          <w:color w:val="555555"/>
+        </w:rPr>
+        <w:t xml:space="preserve"> + d'aller </w:t>
       </w:r>
-    </w:p>
-    <w:p>
-      <w:pPr>
-        <w:pStyle w:val="Heading2"/>
-      </w:pPr>
       <w:r>
-        <w:t>7. Erreurs à éviter</w:t>
+        <w:rPr>
+          <w:b/>
+          <w:i/>
+        </w:rPr>
+        <w:t>chercher</w:t>
       </w:r>
-    </w:p>
-    <w:p>
-      <w:pPr>
-        <w:pStyle w:val="ListBullet"/>
-      </w:pPr>
       <w:r>
-        <w:t>❌ Poster un pavé sans accroche.</w:t>
-      </w:r>
-    </w:p>
-    <w:p>
-      <w:pPr>
-        <w:pStyle w:val="ListBullet"/>
-      </w:pPr>
-      <w:r>
-        <w:t>❌ Mettre le lien dans le post (→ commentaire).</w:t>
-      </w:r>
-    </w:p>
-    <w:p>
-      <w:pPr>
-        <w:pStyle w:val="ListBullet"/>
-      </w:pPr>
-      <w:r>
-        <w:t>❌ Vendre à chaque post (règle : 3 posts qui donnent de la valeur pour 1 qui vend).</w:t>
-      </w:r>
-    </w:p>
-    <w:p>
-      <w:pPr>
-        <w:pStyle w:val="ListBullet"/>
-      </w:pPr>
-      <w:r>
-        <w:t>❌ Disparaître 2 semaines. La régularité &gt; la perfection.</w:t>
-      </w:r>
-    </w:p>
-    <w:p>
-      <w:pPr>
-        <w:pStyle w:val="ListBullet"/>
-      </w:pPr>
-      <w:r>
-        <w:t>❌ Attendre que ce soit « parfait » pour poster. Le build in public, c'est l'imperfection assumée.</w:t>
+        <w:rPr>
+          <w:i/>
+          <w:color w:val="555555"/>
+        </w:rPr>
+        <w:t xml:space="preserve"> ses premières connexions. Le reste suit.</w:t>
       </w:r>
     </w:p>
     <w:sectPr>

</xml_diff>